<commit_message>
Feat(docs): README with conclusions on OmniComp's performance, validation matrix instructions, and additional testing documentation. Update file structure in examples and docs for clarity. Add new validation scripts and reports for comprehensive performance analysis.
</commit_message>
<xml_diff>
--- a/docs/paper.docx
+++ b/docs/paper.docx
@@ -4884,6 +4884,191 @@
       </w:pPr>
       <w:r>
         <w:t>Full reproduction: run 01_*.py, 06_*.py, 09_*.py to generate the corpora, then 02_*.py, 07_*.py, 10_*.py for benchmarks, then 03..11_*.py for analysis and plots.</w:t>
+      </w:r>
+    </w:p>
+    <w:p>
+      <w:r>
+        <w:br w:type="page"/>
+      </w:r>
+    </w:p>
+    <w:p>
+      <w:r>
+        <w:rPr>
+          <w:b/>
+        </w:rPr>
+        <w:t>Implementation Update Addendum (v0.9 Validation)</w:t>
+      </w:r>
+    </w:p>
+    <w:p>
+      <w:r>
+        <w:t>Date: 2026-05-09</w:t>
+      </w:r>
+    </w:p>
+    <w:p>
+      <w:r>
+        <w:t>This addendum documents the validation protocol now required for each project update. For every update, run the validation matrix and update both README and this paper addendum.</w:t>
+      </w:r>
+    </w:p>
+    <w:p>
+      <w:r>
+        <w:rPr>
+          <w:b/>
+        </w:rPr>
+        <w:t>Validation Scope (must be covered each update)</w:t>
+      </w:r>
+    </w:p>
+    <w:p>
+      <w:r>
+        <w:t>- Multiple corpus (synthetic + Silesia + optional external real dataset)</w:t>
+      </w:r>
+    </w:p>
+    <w:p>
+      <w:r>
+        <w:t>- Memory used (process-level RSS tracking)</w:t>
+      </w:r>
+    </w:p>
+    <w:p>
+      <w:r>
+        <w:t>- Real dataset behavior (directory-driven inputs)</w:t>
+      </w:r>
+    </w:p>
+    <w:p>
+      <w:r>
+        <w:t>- Multithreading scaling (1 thread vs N threads)</w:t>
+      </w:r>
+    </w:p>
+    <w:p>
+      <w:r>
+        <w:t>- Small files behavior (hundreds of sub-8 KB files)</w:t>
+      </w:r>
+    </w:p>
+    <w:p>
+      <w:r>
+        <w:t>- Incompressible data behavior (random data)</w:t>
+      </w:r>
+    </w:p>
+    <w:p>
+      <w:r>
+        <w:t>- Streaming behavior (chunked frame sequence round-trip)</w:t>
+      </w:r>
+    </w:p>
+    <w:p>
+      <w:r>
+        <w:t>- Latency (p50/p95 compression and decompression)</w:t>
+      </w:r>
+    </w:p>
+    <w:p>
+      <w:r>
+        <w:rPr>
+          <w:b/>
+        </w:rPr>
+        <w:t>Current Validation Artifacts</w:t>
+      </w:r>
+    </w:p>
+    <w:p>
+      <w:r>
+        <w:t>- Script: examples/validation_matrix.py</w:t>
+      </w:r>
+    </w:p>
+    <w:p>
+      <w:r>
+        <w:t>- Report: docs/validation_report.md</w:t>
+      </w:r>
+    </w:p>
+    <w:p>
+      <w:r>
+        <w:t>- Checklist: docs/TESTING.md</w:t>
+      </w:r>
+    </w:p>
+    <w:p>
+      <w:r>
+        <w:rPr>
+          <w:b/>
+        </w:rPr>
+        <w:t>Latest Snapshot (Level 9)</w:t>
+      </w:r>
+    </w:p>
+    <w:p>
+      <w:r>
+        <w:t>- Silesia blob ratio: 3.541 (zstd -9: 3.588)</w:t>
+      </w:r>
+    </w:p>
+    <w:p>
+      <w:r>
+        <w:t>- Compression throughput: 116 MB/s (zstd -9: 117 MB/s)</w:t>
+      </w:r>
+    </w:p>
+    <w:p>
+      <w:r>
+        <w:t>- Decompression throughput: 2046 MB/s (zstd -9: 1740 MB/s)</w:t>
+      </w:r>
+    </w:p>
+    <w:p>
+      <w:r>
+        <w:t>- Multithreading speedup (1T -&gt; 8T): 3.18x at same ratio</w:t>
+      </w:r>
+    </w:p>
+    <w:p>
+      <w:r>
+        <w:t>- Small files average latency: 0.042 ms per file</w:t>
+      </w:r>
+    </w:p>
+    <w:p>
+      <w:r>
+        <w:t>- 1 MB payload latency: compress p50=0.351 ms, p95=0.431 ms; decompress p50=0.090 ms, p95=0.116 ms</w:t>
+      </w:r>
+    </w:p>
+    <w:p/>
+    <w:p>
+      <w:r>
+        <w:rPr>
+          <w:b/>
+        </w:rPr>
+        <w:t>Validation Execution Update (2026-05-09 01:19)</w:t>
+      </w:r>
+    </w:p>
+    <w:p>
+      <w:r>
+        <w:t>Implemented executable system validation tests in tests/test_validation_matrix.py covering multiple corpus, memory used, real dataset, multithreading, small files, incompressible data, streaming, and latency.</w:t>
+      </w:r>
+    </w:p>
+    <w:p>
+      <w:r>
+        <w:t>Execution status: ALL PASS (roundtrip + validation suite).</w:t>
+      </w:r>
+    </w:p>
+    <w:p>
+      <w:r>
+        <w:t>Detailed metrics and dataset-level outputs are documented in docs/validation_report.md.</w:t>
+      </w:r>
+    </w:p>
+    <w:p/>
+    <w:p>
+      <w:r>
+        <w:rPr>
+          <w:b/>
+        </w:rPr>
+        <w:t>Level Sweep Update (OmniComp 1..22 vs zstd 1..22)</w:t>
+      </w:r>
+    </w:p>
+    <w:p>
+      <w:r>
+        <w:t>Executed same-condition sweeps and exported CSV/Markdown artifacts: docs/level_sweep.csv, docs/level_sweep.md, docs/level_sweep_xray.csv, docs/level_sweep_mixed.csv.</w:t>
+      </w:r>
+    </w:p>
+    <w:p>
+      <w:r>
+        <w:t>Silesia blob finding: OmniComp maintains systematically higher decompression speed than zstd at most levels, while ratio stays close (typically ~1-3% below zstd at same level).</w:t>
+      </w:r>
+    </w:p>
+    <w:p>
+      <w:r>
+        <w:t>Numeric-heavy x-ray finding: OmniComp is strongly superior in both ratio and decompression speed at all levels due to shuffle/predictor specialization.</w:t>
+      </w:r>
+    </w:p>
+    <w:p>
+      <w:r>
+        <w:t>NN/Transformer direction note: for this project objective (decompression-first), neural codecs are currently not competitive because decode compute is far higher than LZ-family decode. Mathematical entropy-model improvements are preferred over neural decode paths.</w:t>
       </w:r>
     </w:p>
     <w:sectPr>

</xml_diff>

<commit_message>
feat(makefile): Enhance Makefile for macOS compatibility with Homebrew zstd installation. Add support for static linking of zstd library and improve error handling. Update build commands to utilize dynamic/static library based on configuration. Add new uv.lock file for package management and update documentation for clarity.
</commit_message>
<xml_diff>
--- a/docs/paper.docx
+++ b/docs/paper.docx
@@ -5069,6 +5069,121 @@
     <w:p>
       <w:r>
         <w:t>NN/Transformer direction note: for this project objective (decompression-first), neural codecs are currently not competitive because decode compute is far higher than LZ-family decode. Mathematical entropy-model improvements are preferred over neural decode paths.</w:t>
+      </w:r>
+    </w:p>
+    <w:p>
+      <w:pPr>
+        <w:pStyle w:val="Heading1"/>
+      </w:pPr>
+      <w:r>
+        <w:t>Niche laboratory: byte-level entropy and autocorrelation</w:t>
+      </w:r>
+    </w:p>
+    <w:p>
+      <w:r>
+        <w:t>This addendum documents offline experiments motivated by weak Silesia per-file cases (notably mr and sao) and a strong control (x-ray). The goal was to relate pipeline/detector signals to residual structure the generic LZ stage may miss.</w:t>
+      </w:r>
+    </w:p>
+    <w:p>
+      <w:r>
+        <w:t>Method (offline, not shipped in the codec): on an early prefix of each file (order of a few MiB), we estimated Shannon entropy H in bits per byte on raw bytes; normalized lag-k byte autocorrelation rho(k) for several strides k; and H on an even-byte-aligned first-order int16 delta stream (little-endian differences b[2i+1:2i+3] interpreted as int16, then unsigned bytes of the residual). The production detector (detector.c) already combines a byte histogram, H, ASCII/bracket cues, and fixed-lag autocorrelation at k in {2,4,8,16,20} in one pass, with 16 KiB stratified subsampling for large blocks—so any extra lags discussed here are research probes beyond the current fixed set.</w:t>
+      </w:r>
+    </w:p>
+    <w:p>
+      <w:pPr>
+        <w:pStyle w:val="Heading2"/>
+      </w:pPr>
+      <w:r>
+        <w:t>Findings (qualitative + benchmark cross-check)</w:t>
+      </w:r>
+    </w:p>
+    <w:p>
+      <w:pPr>
+        <w:pStyle w:val="ListParagraph"/>
+      </w:pPr>
+      <w:r>
+        <w:t>mr (medical float32 stack): raw H is moderate (~3.45 b/B on a 2 MiB prefix) and rho(2) is large (~0.65), consistent with int16-like pairing in the byte stream. First-order int16 delta still leaves a high absolute entropy (~3.06 b/B in our probe) but removes ~0.39 b/B versus the same-length raw window, i.e. measurable smoothness in a fixed int16 view—exactly the regime where specialised predictors/shuffles can help. Silesia CSV (single-thread sweep) matches a mixed story: OmniComp can beat zstd on ratio at low levels (e.g. level 1: about +5.7% ratio vs zstd) at the cost of much higher compression time (~+79%); at high levels OmniComp trails zstd slightly on ratio (e.g. level 22 about -1.6%) while decompression remains close. This is an honest “win some / lose some” niche: structure is there, but the pipeline must not pay too much transform work on every block.</w:t>
+      </w:r>
+    </w:p>
+    <w:p>
+      <w:pPr>
+        <w:pStyle w:val="ListParagraph"/>
+      </w:pPr>
+      <w:r>
+        <w:t>sao (sunspot telemetry): raw H is very high (~7.46 b/B), i.e. almost byte-uniform at first order. Short-lag rho(k) for k in {2,4,8,16,20} stays near zero, so the current fixed autocorrelation set does not flag obvious periodicity. A coarser probe still finds non-trivial rho(28) (~0.21), suggesting a possible ~28-byte instrument cadence that is invisible to the hard-coded small-lag set. Blind int16 delta on this file increases H (harmful), so any delta/shuffle path must be gated—e.g. only when a transform provably lowers block entropy. Benchmarks: OmniComp stays within roughly a few tenths of a percent below zstd on ratio across levels while decompression speed is competitive or better—no dramatic failure, but also no easy win.</w:t>
+      </w:r>
+    </w:p>
+    <w:p>
+      <w:pPr>
+        <w:pStyle w:val="ListParagraph"/>
+      </w:pPr>
+      <w:r>
+        <w:t>x-ray (16-bit tomography): int16 delta removes about ~1.49 b/B of Shannon uncertainty in our probe (raw ~6.29 b/B to residual-stream ~4.79 b/B on a 2 MiB prefix), aligning with strong spatial smoothness. Per-file benchmarks show large ratio advantages for OmniComp over zstd (single-thread sweep: roughly +8% to +39% depending on level) with faster decompression—this is the clearest positive control that numeric/shuffle specialisation matches measurable byte-level predictability.</w:t>
+      </w:r>
+    </w:p>
+    <w:p>
+      <w:pPr>
+        <w:pStyle w:val="Heading2"/>
+      </w:pPr>
+      <w:r>
+        <w:t>Takeaways and negative results</w:t>
+      </w:r>
+    </w:p>
+    <w:p>
+      <w:r>
+        <w:t>Positive: coupling simple byte-level probes (H, rho(k), delta-H) with Silesia per-file tables explains why x-ray is an easy win and why mr is “structurally rich” but sensitive to speed/ratio trade-offs.</w:t>
+      </w:r>
+    </w:p>
+    <w:p>
+      <w:r>
+        <w:t>Negative / cautionary: high H plus weak short-lag autocorrelation does not mean “no structure”; sao shows that missing lags in the detector can hide real periodicities. Applying int16 delta without a guard is a demonstrably bad idea on sao-like data.</w:t>
+      </w:r>
+    </w:p>
+    <w:p>
+      <w:r>
+        <w:t>Engineering directions implied by this lab (not all implemented): extend autocorrelation beyond the fixed {2,4,8,16,20} set with a few cheap extra lags or a short bounded scan; only enable numeric transforms when a block-level statistic shows entropy reduction; keep reporting both ratio and comp/decomp time per corpus file to avoid overfitting to a single headline metric.</w:t>
+      </w:r>
+    </w:p>
+    <w:p>
+      <w:pPr>
+        <w:pStyle w:val="Heading2"/>
+      </w:pPr>
+      <w:r>
+        <w:t>Silesia blob: global metrics (multicore)</w:t>
+      </w:r>
+    </w:p>
+    <w:p>
+      <w:r>
+        <w:t>For end-to-end “global” comparisons we use the concatenated Silesia corpus (~202 MiB) at the same numeric level for zstd and OmniComp. With eight compression threads (zstd ``--threads 8``; OmniComp ``n_threads=8``), decompression remains single-threaded in both stacks—so decompression MB/s is the headline decode speed. A fresh run (best-of-2 wall times per side, isolated child processes) produced the following blob-level deltas (OmniComp vs zstd): ratio about -0.18% to -1.93% across levels 1,3,9,12,15,22; decompression throughput about +10% to +29% in favour of OmniComp on this machine. Compression wall time is mixed (Omni much faster at L22 thanks to parallel blocks; slower at L1 on this run). Per-file tables in ``docs/silesia_per_file_8t.csv`` explain which members drag ratio (e.g. ``mozilla``, ``webster``) versus where numeric niches dominate (``x-ray``).</w:t>
+      </w:r>
+    </w:p>
+    <w:p>
+      <w:r>
+        <w:t>Pipeline experiment (ratio-oriented, rebuilt and re-benchmarked): the embedded detector still uses fixed byte autocorrelation lags {2,4,8,16,20}; offline probes showed ``sao`` can exhibit strong correlation at lag 28 while short lags stay flat, so the detector cannot yet express that periodicity as a shuffle niche. ``pipeline.c`` was tightened so the competitive cascade compares plain zstd when a specialised codec leaves more than ~88% of the raw block size (previously ~90%), and the “predictor clearly won” skip under smart cascade now requires output below ~30% of raw size (previously ~40%). After rebuilding ``libomnicomp_pipeline.{so,dylib}`` and re-running the full eight-thread Silesia blob sweep, ``docs/silesia_vs_zstd_metrics_8t.csv`` matches the prior headline ratios to six decimal places—on this corpus the threshold change sits below the blob-level rounding (or is offset by noise); wall-clock decompression MB/s still shows a clear OmniComp advantage. Further ratio gains likely need structural features (e.g. an explicit ~28-byte stride path with aligned block policy), not only cascade tuning.</w:t>
+      </w:r>
+    </w:p>
+    <w:p>
+      <w:pPr>
+        <w:pStyle w:val="ListParagraph"/>
+      </w:pPr>
+      <w:r>
+        <w:t>Good: decompression-first goal is met on the blob—OmniComp decode is systematically faster than zstd at the same level in the 8-thread sweep.</w:t>
+      </w:r>
+    </w:p>
+    <w:p>
+      <w:pPr>
+        <w:pStyle w:val="ListParagraph"/>
+      </w:pPr>
+      <w:r>
+        <w:t>Bad: aggregate compression ratio on the full blob still trails zstd by roughly 0.2–2 percentage points depending on level; text-heavy files remain the hard region for niche transforms.</w:t>
+      </w:r>
+    </w:p>
+    <w:p>
+      <w:pPr>
+        <w:pStyle w:val="ListParagraph"/>
+      </w:pPr>
+      <w:r>
+        <w:t>Byte-level diagnosis (see “Niche laboratory” above): ``x-ray`` shows large entropy reduction under int16-delta probes and strong benchmark wins; ``mr`` shows moderate delta gain with mixed ratio vs zstd by level; ``sao`` shows high byte entropy and harmful blind int16 delta—any future stride-28 machinery must be size-aligned and gated.</w:t>
       </w:r>
     </w:p>
     <w:sectPr>

</xml_diff>